<commit_message>
Update student name to V KALPANA in project report
</commit_message>
<xml_diff>
--- a/LoveMind_Project_Report.docx
+++ b/LoveMind_Project_Report.docx
@@ -44,7 +44,7 @@
           <w:bCs/>
           <w:b/>
         </w:rPr>
-        <w:t xml:space="preserve">V SADHANA (2403727710622168)</w:t>
+        <w:t xml:space="preserve">V KALPANA (2403727710622168)</w:t>
       </w:r>
     </w:p>
     <w:p>
@@ -102,7 +102,7 @@
         <w:t xml:space="preserve"> </w:t>
       </w:r>
       <w:r>
-        <w:t xml:space="preserve">Kuniamuthur, Coimbatore – 641008.</w:t>
+        <w:t xml:space="preserve">Kuniamuthur, Coimbatore â€“ 641008.</w:t>
       </w:r>
       <w:r>
         <w:t xml:space="preserve"> </w:t>
@@ -144,7 +144,7 @@
           <w:bCs/>
           <w:b/>
         </w:rPr>
-        <w:t xml:space="preserve">SDG 3 – Good Health and Well-being</w:t>
+        <w:t xml:space="preserve">SDG 3 â€“ Good Health and Well-being</w:t>
       </w:r>
       <w:r>
         <w:t xml:space="preserve"> </w:t>
@@ -160,7 +160,7 @@
           <w:bCs/>
           <w:b/>
         </w:rPr>
-        <w:t xml:space="preserve">SDG 9 – Industry, Innovation and Infrastructure</w:t>
+        <w:t xml:space="preserve">SDG 9 â€“ Industry, Innovation and Infrastructure</w:t>
       </w:r>
       <w:r>
         <w:t xml:space="preserve">.</w:t>
@@ -235,7 +235,7 @@
               <w:jc w:val="left"/>
             </w:pPr>
             <w:r>
-              <w:t xml:space="preserve">SDG 3 – Good Health and Well-being and SDG 9 – Industry, Innovation and Infrastructure.</w:t>
+              <w:t xml:space="preserve">SDG 3 â€“ Good Health and Well-being and SDG 9 â€“ Industry, Innovation and Infrastructure.</w:t>
             </w:r>
           </w:p>
         </w:tc>
@@ -341,35 +341,17 @@
         <w:pStyle w:val="FirstParagraph"/>
       </w:pPr>
       <w:r>
-        <w:t xml:space="preserve">Certified that this mini project report titled</w:t>
-      </w:r>
-      <w:r>
-        <w:t xml:space="preserve"> </w:t>
-      </w:r>
-      <w:r>
-        <w:t xml:space="preserve">“</w:t>
-      </w:r>
-      <w:r>
-        <w:t xml:space="preserve">LoveMind – An AI Proxy Character Dating App</w:t>
-      </w:r>
-      <w:r>
-        <w:t xml:space="preserve">”</w:t>
-      </w:r>
-      <w:r>
-        <w:t xml:space="preserve"> </w:t>
-      </w:r>
-      <w:r>
-        <w:t xml:space="preserve">is the bonafide work of</w:t>
-      </w:r>
-      <w:r>
-        <w:t xml:space="preserve"> </w:t>
-      </w:r>
-      <w:r>
-        <w:rPr>
-          <w:bCs/>
-          <w:b/>
-        </w:rPr>
-        <w:t xml:space="preserve">V SADHANA (2403727710622168)</w:t>
+        <w:t xml:space="preserve">Certified that this mini project report titled â€œLoveMind â€“ An AI Proxy Character Dating Appâ€ is the bonafide work of</w:t>
+      </w:r>
+      <w:r>
+        <w:t xml:space="preserve"> </w:t>
+      </w:r>
+      <w:r>
+        <w:rPr>
+          <w:bCs/>
+          <w:b/>
+        </w:rPr>
+        <w:t xml:space="preserve">V KALPANA (2403727710622168)</w:t>
       </w:r>
       <w:r>
         <w:t xml:space="preserve"> </w:t>
@@ -427,7 +409,7 @@
         <w:t xml:space="preserve"> </w:t>
       </w:r>
       <w:r>
-        <w:t xml:space="preserve">Kuniyamuthur, Coimbatore–641008.</w:t>
+        <w:t xml:space="preserve">Kuniyamuthur, Coimbatoreâ€“641008.</w:t>
       </w:r>
     </w:p>
     <w:p>
@@ -473,7 +455,7 @@
         <w:t xml:space="preserve"> </w:t>
       </w:r>
       <w:r>
-        <w:t xml:space="preserve">Kuniyamuthur, Coimbatore–641008.</w:t>
+        <w:t xml:space="preserve">Kuniyamuthur, Coimbatoreâ€“641008.</w:t>
       </w:r>
     </w:p>
     <w:p>
@@ -601,7 +583,7 @@
           <w:bCs/>
           <w:b/>
         </w:rPr>
-        <w:t xml:space="preserve">LoveMind – An AI Proxy Character Dating App</w:t>
+        <w:t xml:space="preserve">LoveMind â€“ An AI Proxy Character Dating App</w:t>
       </w:r>
       <w:r>
         <w:t xml:space="preserve"> </w:t>
@@ -2136,13 +2118,13 @@
         <w:t xml:space="preserve">CHAPTER 7: APPENDICES</w:t>
       </w:r>
     </w:p>
-    <w:bookmarkStart w:id="47" w:name="appendix-i-source-code"/>
+    <w:bookmarkStart w:id="47" w:name="appendix-i-â-source-code"/>
     <w:p>
       <w:pPr>
         <w:pStyle w:val="Heading3"/>
       </w:pPr>
       <w:r>
-        <w:t xml:space="preserve">Appendix I – Source Code</w:t>
+        <w:t xml:space="preserve">Appendix I â€“ Source Code</w:t>
       </w:r>
     </w:p>
     <w:p>
@@ -2217,13 +2199,13 @@
       </w:r>
     </w:p>
     <w:bookmarkEnd w:id="47"/>
-    <w:bookmarkStart w:id="48" w:name="appendix-ii-screenshots"/>
+    <w:bookmarkStart w:id="48" w:name="appendix-ii-â-screenshots"/>
     <w:p>
       <w:pPr>
         <w:pStyle w:val="Heading3"/>
       </w:pPr>
       <w:r>
-        <w:t xml:space="preserve">Appendix II – Screenshots</w:t>
+        <w:t xml:space="preserve">Appendix II â€“ Screenshots</w:t>
       </w:r>
     </w:p>
     <w:p>

</xml_diff>